<commit_message>
docs: actualizar referencias al repo omoncada730/foodplease-entregable7
- README raiz: agregar badge y URL del repo
- backend/README.md: actualizar git clone y arbol de directorios al monorepo
- mobile/README.md: referir a backend/ del monorepo en vez de foodplease-app
- docs/adr/ADR-004,005: reflejar estructura backend/ y mobile/ del monorepo
- docs/aptc106_s11grupo1.docx: regenerado con bibliografia apuntando al nuevo repo
</commit_message>
<xml_diff>
--- a/docs/aptc106_s11grupo1.docx
+++ b/docs/aptc106_s11grupo1.docx
@@ -1710,7 +1710,7 @@
                 <w:color w:val="222222"/>
                 <w:sz w:val="20"/>
               </w:rPr>
-              <w:t>heroku create foodplease-app</w:t>
+              <w:t>heroku create foodplease-entregable7 (nombre de la app en Heroku)</w:t>
             </w:r>
           </w:p>
         </w:tc>
@@ -3673,7 +3673,7 @@
           <w:color w:val="222222"/>
           <w:sz w:val="20"/>
         </w:rPr>
-        <w:t>Equipo FoodPlease. (2026). Repositorio foodplease-app. GitHub. https://github.com/Priscila446/foodplease-app</w:t>
+        <w:t>Moncada, O. (2026). Repositorio foodplease-entregable7 (monorepo: backend Flask, mobile Capacitor, docs/adr). GitHub. https://github.com/omoncada730/foodplease-entregable7</w:t>
       </w:r>
     </w:p>
     <w:p>

</xml_diff>